<commit_message>
Changed name of author
</commit_message>
<xml_diff>
--- a/CC_LA2_069.docx
+++ b/CC_LA2_069.docx
@@ -277,8 +277,19 @@
         <w:spacing w:after="480"/>
         <w:jc w:val="center"/>
       </w:pPr>
-      <w:r>
-        <w:t>Darshan A M</w:t>
+      <w:proofErr w:type="gramStart"/>
+      <w:r>
+        <w:t>Darshan</w:t>
+      </w:r>
+      <w:r>
+        <w:t xml:space="preserve"> </w:t>
+      </w:r>
+      <w:r>
+        <w:t xml:space="preserve"> A</w:t>
+      </w:r>
+      <w:proofErr w:type="gramEnd"/>
+      <w:r>
+        <w:t xml:space="preserve"> M</w:t>
       </w:r>
       <w:r>
         <w:tab/>
@@ -541,7 +552,6 @@
     </w:p>
     <w:tbl>
       <w:tblPr>
-        <w:tblStyle w:val="Normal"/>
         <w:tblW w:w="9360" w:type="dxa"/>
         <w:tblBorders>
           <w:top w:val="single" w:sz="4" w:space="0" w:color="auto"/>
@@ -615,29 +625,6 @@
           </w:p>
         </w:tc>
       </w:tr>
-    </w:tbl>
-    <w:tbl>
-      <w:tblPr>
-        <w:tblW w:w="9360" w:type="dxa"/>
-        <w:tblBorders>
-          <w:top w:val="single" w:sz="4" w:space="0" w:color="auto"/>
-          <w:left w:val="single" w:sz="4" w:space="0" w:color="auto"/>
-          <w:bottom w:val="single" w:sz="4" w:space="0" w:color="auto"/>
-          <w:right w:val="single" w:sz="4" w:space="0" w:color="auto"/>
-          <w:insideH w:val="single" w:sz="4" w:space="0" w:color="auto"/>
-          <w:insideV w:val="single" w:sz="4" w:space="0" w:color="auto"/>
-        </w:tblBorders>
-        <w:tblCellMar>
-          <w:left w:w="10" w:type="dxa"/>
-          <w:right w:w="10" w:type="dxa"/>
-        </w:tblCellMar>
-        <w:tblLook w:val="04A0" w:firstRow="1" w:lastRow="0" w:firstColumn="1" w:lastColumn="0" w:noHBand="0" w:noVBand="1"/>
-      </w:tblPr>
-      <w:tblGrid>
-        <w:gridCol w:w="720"/>
-        <w:gridCol w:w="7200"/>
-        <w:gridCol w:w="1440"/>
-      </w:tblGrid>
       <w:tr>
         <w:tc>
           <w:tcPr>
@@ -1694,12 +1681,6 @@
         <w:gridCol w:w="2276"/>
       </w:tblGrid>
       <w:tr>
-        <w:tblPrEx>
-          <w:tblCellMar>
-            <w:top w:w="0" w:type="dxa"/>
-            <w:bottom w:w="0" w:type="dxa"/>
-          </w:tblCellMar>
-        </w:tblPrEx>
         <w:trPr>
           <w:tblHeader/>
         </w:trPr>
@@ -1817,12 +1798,6 @@
         </w:tc>
       </w:tr>
       <w:tr>
-        <w:tblPrEx>
-          <w:tblCellMar>
-            <w:top w:w="0" w:type="dxa"/>
-            <w:bottom w:w="0" w:type="dxa"/>
-          </w:tblCellMar>
-        </w:tblPrEx>
         <w:tc>
           <w:tcPr>
             <w:tcW w:w="2200" w:type="dxa"/>
@@ -1929,12 +1904,6 @@
         </w:tc>
       </w:tr>
       <w:tr>
-        <w:tblPrEx>
-          <w:tblCellMar>
-            <w:top w:w="0" w:type="dxa"/>
-            <w:bottom w:w="0" w:type="dxa"/>
-          </w:tblCellMar>
-        </w:tblPrEx>
         <w:tc>
           <w:tcPr>
             <w:tcW w:w="2200" w:type="dxa"/>
@@ -2041,12 +2010,6 @@
         </w:tc>
       </w:tr>
       <w:tr>
-        <w:tblPrEx>
-          <w:tblCellMar>
-            <w:top w:w="0" w:type="dxa"/>
-            <w:bottom w:w="0" w:type="dxa"/>
-          </w:tblCellMar>
-        </w:tblPrEx>
         <w:tc>
           <w:tcPr>
             <w:tcW w:w="2200" w:type="dxa"/>
@@ -2153,12 +2116,6 @@
         </w:tc>
       </w:tr>
       <w:tr>
-        <w:tblPrEx>
-          <w:tblCellMar>
-            <w:top w:w="0" w:type="dxa"/>
-            <w:bottom w:w="0" w:type="dxa"/>
-          </w:tblCellMar>
-        </w:tblPrEx>
         <w:tc>
           <w:tcPr>
             <w:tcW w:w="2200" w:type="dxa"/>
@@ -2265,12 +2222,6 @@
         </w:tc>
       </w:tr>
       <w:tr>
-        <w:tblPrEx>
-          <w:tblCellMar>
-            <w:top w:w="0" w:type="dxa"/>
-            <w:bottom w:w="0" w:type="dxa"/>
-          </w:tblCellMar>
-        </w:tblPrEx>
         <w:tc>
           <w:tcPr>
             <w:tcW w:w="2200" w:type="dxa"/>
@@ -8056,12 +8007,6 @@
         <w:gridCol w:w="4826"/>
       </w:tblGrid>
       <w:tr>
-        <w:tblPrEx>
-          <w:tblCellMar>
-            <w:top w:w="0" w:type="dxa"/>
-            <w:bottom w:w="0" w:type="dxa"/>
-          </w:tblCellMar>
-        </w:tblPrEx>
         <w:trPr>
           <w:tblHeader/>
         </w:trPr>
@@ -8223,12 +8168,6 @@
         </w:tc>
       </w:tr>
       <w:tr>
-        <w:tblPrEx>
-          <w:tblCellMar>
-            <w:top w:w="0" w:type="dxa"/>
-            <w:bottom w:w="0" w:type="dxa"/>
-          </w:tblCellMar>
-        </w:tblPrEx>
         <w:tc>
           <w:tcPr>
             <w:tcW w:w="900" w:type="dxa"/>
@@ -8379,12 +8318,6 @@
         </w:tc>
       </w:tr>
       <w:tr>
-        <w:tblPrEx>
-          <w:tblCellMar>
-            <w:top w:w="0" w:type="dxa"/>
-            <w:bottom w:w="0" w:type="dxa"/>
-          </w:tblCellMar>
-        </w:tblPrEx>
         <w:tc>
           <w:tcPr>
             <w:tcW w:w="900" w:type="dxa"/>
@@ -8535,12 +8468,6 @@
         </w:tc>
       </w:tr>
       <w:tr>
-        <w:tblPrEx>
-          <w:tblCellMar>
-            <w:top w:w="0" w:type="dxa"/>
-            <w:bottom w:w="0" w:type="dxa"/>
-          </w:tblCellMar>
-        </w:tblPrEx>
         <w:tc>
           <w:tcPr>
             <w:tcW w:w="900" w:type="dxa"/>
@@ -8691,12 +8618,6 @@
         </w:tc>
       </w:tr>
       <w:tr>
-        <w:tblPrEx>
-          <w:tblCellMar>
-            <w:top w:w="0" w:type="dxa"/>
-            <w:bottom w:w="0" w:type="dxa"/>
-          </w:tblCellMar>
-        </w:tblPrEx>
         <w:tc>
           <w:tcPr>
             <w:tcW w:w="900" w:type="dxa"/>
@@ -8847,12 +8768,6 @@
         </w:tc>
       </w:tr>
       <w:tr>
-        <w:tblPrEx>
-          <w:tblCellMar>
-            <w:top w:w="0" w:type="dxa"/>
-            <w:bottom w:w="0" w:type="dxa"/>
-          </w:tblCellMar>
-        </w:tblPrEx>
         <w:tc>
           <w:tcPr>
             <w:tcW w:w="900" w:type="dxa"/>
@@ -9003,12 +8918,6 @@
         </w:tc>
       </w:tr>
       <w:tr>
-        <w:tblPrEx>
-          <w:tblCellMar>
-            <w:top w:w="0" w:type="dxa"/>
-            <w:bottom w:w="0" w:type="dxa"/>
-          </w:tblCellMar>
-        </w:tblPrEx>
         <w:tc>
           <w:tcPr>
             <w:tcW w:w="900" w:type="dxa"/>
@@ -9159,12 +9068,6 @@
         </w:tc>
       </w:tr>
       <w:tr>
-        <w:tblPrEx>
-          <w:tblCellMar>
-            <w:top w:w="0" w:type="dxa"/>
-            <w:bottom w:w="0" w:type="dxa"/>
-          </w:tblCellMar>
-        </w:tblPrEx>
         <w:tc>
           <w:tcPr>
             <w:tcW w:w="900" w:type="dxa"/>
@@ -9315,12 +9218,6 @@
         </w:tc>
       </w:tr>
       <w:tr>
-        <w:tblPrEx>
-          <w:tblCellMar>
-            <w:top w:w="0" w:type="dxa"/>
-            <w:bottom w:w="0" w:type="dxa"/>
-          </w:tblCellMar>
-        </w:tblPrEx>
         <w:tc>
           <w:tcPr>
             <w:tcW w:w="900" w:type="dxa"/>
@@ -9471,12 +9368,6 @@
         </w:tc>
       </w:tr>
       <w:tr>
-        <w:tblPrEx>
-          <w:tblCellMar>
-            <w:top w:w="0" w:type="dxa"/>
-            <w:bottom w:w="0" w:type="dxa"/>
-          </w:tblCellMar>
-        </w:tblPrEx>
         <w:tc>
           <w:tcPr>
             <w:tcW w:w="900" w:type="dxa"/>
@@ -9627,12 +9518,6 @@
         </w:tc>
       </w:tr>
       <w:tr>
-        <w:tblPrEx>
-          <w:tblCellMar>
-            <w:top w:w="0" w:type="dxa"/>
-            <w:bottom w:w="0" w:type="dxa"/>
-          </w:tblCellMar>
-        </w:tblPrEx>
         <w:tc>
           <w:tcPr>
             <w:tcW w:w="900" w:type="dxa"/>
@@ -9783,12 +9668,6 @@
         </w:tc>
       </w:tr>
       <w:tr>
-        <w:tblPrEx>
-          <w:tblCellMar>
-            <w:top w:w="0" w:type="dxa"/>
-            <w:bottom w:w="0" w:type="dxa"/>
-          </w:tblCellMar>
-        </w:tblPrEx>
         <w:tc>
           <w:tcPr>
             <w:tcW w:w="900" w:type="dxa"/>
@@ -9939,12 +9818,6 @@
         </w:tc>
       </w:tr>
       <w:tr>
-        <w:tblPrEx>
-          <w:tblCellMar>
-            <w:top w:w="0" w:type="dxa"/>
-            <w:bottom w:w="0" w:type="dxa"/>
-          </w:tblCellMar>
-        </w:tblPrEx>
         <w:tc>
           <w:tcPr>
             <w:tcW w:w="900" w:type="dxa"/>
@@ -10095,12 +9968,6 @@
         </w:tc>
       </w:tr>
       <w:tr>
-        <w:tblPrEx>
-          <w:tblCellMar>
-            <w:top w:w="0" w:type="dxa"/>
-            <w:bottom w:w="0" w:type="dxa"/>
-          </w:tblCellMar>
-        </w:tblPrEx>
         <w:tc>
           <w:tcPr>
             <w:tcW w:w="900" w:type="dxa"/>
@@ -10251,12 +10118,6 @@
         </w:tc>
       </w:tr>
       <w:tr>
-        <w:tblPrEx>
-          <w:tblCellMar>
-            <w:top w:w="0" w:type="dxa"/>
-            <w:bottom w:w="0" w:type="dxa"/>
-          </w:tblCellMar>
-        </w:tblPrEx>
         <w:tc>
           <w:tcPr>
             <w:tcW w:w="900" w:type="dxa"/>

</xml_diff>